<commit_message>
Split closure packages: separate AD 50427831 governance package
Add a standalone closure package for AD 50427831 (proactive obsolescence
governance), fix the test-step grid width in the CI23514 package, and
remove the combined CI23514 + 50427831 package.

Co-Authored-By: Claude Opus 5.5 <noreply@anthropic.com>
Claude-Session: https://claude.ai/code/session_01XzRZ2SAnHh47JV1auqx4DH
</commit_message>
<xml_diff>
--- a/BSI.IT.5.R4_CI23514_Obsolete_Databases_Closure_Package.docx
+++ b/BSI.IT.5.R4_CI23514_Obsolete_Databases_Closure_Package.docx
@@ -1228,9 +1228,9 @@
       </w:tblPr>
       <w:tblGrid>
         <w:gridCol w:w="380"/>
-        <w:gridCol w:w="5500"/>
+        <w:gridCol w:w="5380"/>
         <w:gridCol w:w="380"/>
-        <w:gridCol w:w="5260"/>
+        <w:gridCol w:w="5380"/>
       </w:tblGrid>
       <w:tr>
         <w:tc>
@@ -1309,7 +1309,7 @@
         </w:tc>
         <w:tc>
           <w:tcPr>
-            <w:tcW w:type="dxa" w:w="5500"/>
+            <w:tcW w:type="dxa" w:w="5380"/>
             <w:tcBorders>
               <w:top w:val="single" w:color="BFBFBF" w:sz="4"/>
               <w:left w:val="single" w:color="BFBFBF" w:sz="4"/>
@@ -1325,7 +1325,7 @@
           </w:tcPr>
           <w:tbl>
             <w:tblPr>
-              <w:tblW w:type="dxa" w:w="5380"/>
+              <w:tblW w:type="dxa" w:w="5260"/>
               <w:tblBorders>
                 <w:top w:val="single" w:color="auto" w:sz="4"/>
                 <w:left w:val="single" w:color="auto" w:sz="4"/>
@@ -1337,7 +1337,7 @@
             </w:tblPr>
             <w:tblGrid>
               <w:gridCol w:w="1500"/>
-              <w:gridCol w:w="3880"/>
+              <w:gridCol w:w="3760"/>
             </w:tblGrid>
             <w:tr>
               <w:tc>
@@ -1376,7 +1376,7 @@
               </w:tc>
               <w:tc>
                 <w:tcPr>
-                  <w:tcW w:type="dxa" w:w="3880"/>
+                  <w:tcW w:type="dxa" w:w="3760"/>
                   <w:tcBorders>
                     <w:top w:val="single" w:color="BFBFBF" w:sz="4"/>
                     <w:left w:val="single" w:color="BFBFBF" w:sz="4"/>
@@ -1446,7 +1446,7 @@
               </w:tc>
               <w:tc>
                 <w:tcPr>
-                  <w:tcW w:type="dxa" w:w="3880"/>
+                  <w:tcW w:type="dxa" w:w="3760"/>
                   <w:tcBorders>
                     <w:top w:val="single" w:color="BFBFBF" w:sz="4"/>
                     <w:left w:val="single" w:color="BFBFBF" w:sz="4"/>
@@ -1512,7 +1512,7 @@
               </w:tc>
               <w:tc>
                 <w:tcPr>
-                  <w:tcW w:type="dxa" w:w="3880"/>
+                  <w:tcW w:type="dxa" w:w="3760"/>
                   <w:tcBorders>
                     <w:top w:val="single" w:color="BFBFBF" w:sz="4"/>
                     <w:left w:val="single" w:color="BFBFBF" w:sz="4"/>
@@ -1578,7 +1578,7 @@
               </w:tc>
               <w:tc>
                 <w:tcPr>
-                  <w:tcW w:type="dxa" w:w="3880"/>
+                  <w:tcW w:type="dxa" w:w="3760"/>
                   <w:tcBorders>
                     <w:top w:val="single" w:color="BFBFBF" w:sz="4"/>
                     <w:left w:val="single" w:color="BFBFBF" w:sz="4"/>
@@ -1667,7 +1667,7 @@
               </w:tc>
               <w:tc>
                 <w:tcPr>
-                  <w:tcW w:type="dxa" w:w="3880"/>
+                  <w:tcW w:type="dxa" w:w="3760"/>
                   <w:tcBorders>
                     <w:top w:val="single" w:color="BFBFBF" w:sz="4"/>
                     <w:left w:val="single" w:color="BFBFBF" w:sz="4"/>
@@ -1810,7 +1810,7 @@
               </w:tc>
               <w:tc>
                 <w:tcPr>
-                  <w:tcW w:type="dxa" w:w="3880"/>
+                  <w:tcW w:type="dxa" w:w="3760"/>
                   <w:tcBorders>
                     <w:top w:val="single" w:color="BFBFBF" w:sz="4"/>
                     <w:left w:val="single" w:color="BFBFBF" w:sz="4"/>
@@ -1880,7 +1880,7 @@
         </w:tc>
         <w:tc>
           <w:tcPr>
-            <w:tcW w:type="dxa" w:w="5500"/>
+            <w:tcW w:type="dxa" w:w="5380"/>
             <w:tcBorders>
               <w:top w:val="single" w:color="BFBFBF" w:sz="4"/>
               <w:left w:val="single" w:color="BFBFBF" w:sz="4"/>
@@ -1896,7 +1896,7 @@
           </w:tcPr>
           <w:tbl>
             <w:tblPr>
-              <w:tblW w:type="dxa" w:w="5380"/>
+              <w:tblW w:type="dxa" w:w="5260"/>
               <w:tblBorders>
                 <w:top w:val="single" w:color="auto" w:sz="4"/>
                 <w:left w:val="single" w:color="auto" w:sz="4"/>
@@ -1908,7 +1908,7 @@
             </w:tblPr>
             <w:tblGrid>
               <w:gridCol w:w="1500"/>
-              <w:gridCol w:w="3880"/>
+              <w:gridCol w:w="3760"/>
             </w:tblGrid>
             <w:tr>
               <w:tc>
@@ -1947,7 +1947,7 @@
               </w:tc>
               <w:tc>
                 <w:tcPr>
-                  <w:tcW w:type="dxa" w:w="3880"/>
+                  <w:tcW w:type="dxa" w:w="3760"/>
                   <w:tcBorders>
                     <w:top w:val="single" w:color="BFBFBF" w:sz="4"/>
                     <w:left w:val="single" w:color="BFBFBF" w:sz="4"/>
@@ -2017,7 +2017,7 @@
               </w:tc>
               <w:tc>
                 <w:tcPr>
-                  <w:tcW w:type="dxa" w:w="3880"/>
+                  <w:tcW w:type="dxa" w:w="3760"/>
                   <w:tcBorders>
                     <w:top w:val="single" w:color="BFBFBF" w:sz="4"/>
                     <w:left w:val="single" w:color="BFBFBF" w:sz="4"/>
@@ -2083,7 +2083,7 @@
               </w:tc>
               <w:tc>
                 <w:tcPr>
-                  <w:tcW w:type="dxa" w:w="3880"/>
+                  <w:tcW w:type="dxa" w:w="3760"/>
                   <w:tcBorders>
                     <w:top w:val="single" w:color="BFBFBF" w:sz="4"/>
                     <w:left w:val="single" w:color="BFBFBF" w:sz="4"/>
@@ -2149,7 +2149,7 @@
               </w:tc>
               <w:tc>
                 <w:tcPr>
-                  <w:tcW w:type="dxa" w:w="3880"/>
+                  <w:tcW w:type="dxa" w:w="3760"/>
                   <w:tcBorders>
                     <w:top w:val="single" w:color="BFBFBF" w:sz="4"/>
                     <w:left w:val="single" w:color="BFBFBF" w:sz="4"/>
@@ -2220,7 +2220,7 @@
               </w:tc>
               <w:tc>
                 <w:tcPr>
-                  <w:tcW w:type="dxa" w:w="3880"/>
+                  <w:tcW w:type="dxa" w:w="3760"/>
                   <w:tcBorders>
                     <w:top w:val="single" w:color="BFBFBF" w:sz="4"/>
                     <w:left w:val="single" w:color="BFBFBF" w:sz="4"/>
@@ -2345,7 +2345,7 @@
               </w:tc>
               <w:tc>
                 <w:tcPr>
-                  <w:tcW w:type="dxa" w:w="3880"/>
+                  <w:tcW w:type="dxa" w:w="3760"/>
                   <w:tcBorders>
                     <w:top w:val="single" w:color="BFBFBF" w:sz="4"/>
                     <w:left w:val="single" w:color="BFBFBF" w:sz="4"/>
@@ -2420,7 +2420,7 @@
         </w:tc>
         <w:tc>
           <w:tcPr>
-            <w:tcW w:type="dxa" w:w="5500"/>
+            <w:tcW w:type="dxa" w:w="5380"/>
             <w:tcBorders>
               <w:top w:val="single" w:color="BFBFBF" w:sz="4"/>
               <w:left w:val="single" w:color="BFBFBF" w:sz="4"/>
@@ -2436,7 +2436,7 @@
           </w:tcPr>
           <w:tbl>
             <w:tblPr>
-              <w:tblW w:type="dxa" w:w="5380"/>
+              <w:tblW w:type="dxa" w:w="5260"/>
               <w:tblBorders>
                 <w:top w:val="single" w:color="auto" w:sz="4"/>
                 <w:left w:val="single" w:color="auto" w:sz="4"/>
@@ -2448,7 +2448,7 @@
             </w:tblPr>
             <w:tblGrid>
               <w:gridCol w:w="1500"/>
-              <w:gridCol w:w="3880"/>
+              <w:gridCol w:w="3760"/>
             </w:tblGrid>
             <w:tr>
               <w:tc>
@@ -2487,7 +2487,7 @@
               </w:tc>
               <w:tc>
                 <w:tcPr>
-                  <w:tcW w:type="dxa" w:w="3880"/>
+                  <w:tcW w:type="dxa" w:w="3760"/>
                   <w:tcBorders>
                     <w:top w:val="single" w:color="BFBFBF" w:sz="4"/>
                     <w:left w:val="single" w:color="BFBFBF" w:sz="4"/>
@@ -2557,7 +2557,7 @@
               </w:tc>
               <w:tc>
                 <w:tcPr>
-                  <w:tcW w:type="dxa" w:w="3880"/>
+                  <w:tcW w:type="dxa" w:w="3760"/>
                   <w:tcBorders>
                     <w:top w:val="single" w:color="BFBFBF" w:sz="4"/>
                     <w:left w:val="single" w:color="BFBFBF" w:sz="4"/>
@@ -2623,7 +2623,7 @@
               </w:tc>
               <w:tc>
                 <w:tcPr>
-                  <w:tcW w:type="dxa" w:w="3880"/>
+                  <w:tcW w:type="dxa" w:w="3760"/>
                   <w:tcBorders>
                     <w:top w:val="single" w:color="BFBFBF" w:sz="4"/>
                     <w:left w:val="single" w:color="BFBFBF" w:sz="4"/>
@@ -2689,7 +2689,7 @@
               </w:tc>
               <w:tc>
                 <w:tcPr>
-                  <w:tcW w:type="dxa" w:w="3880"/>
+                  <w:tcW w:type="dxa" w:w="3760"/>
                   <w:tcBorders>
                     <w:top w:val="single" w:color="BFBFBF" w:sz="4"/>
                     <w:left w:val="single" w:color="BFBFBF" w:sz="4"/>
@@ -2778,7 +2778,7 @@
               </w:tc>
               <w:tc>
                 <w:tcPr>
-                  <w:tcW w:type="dxa" w:w="3880"/>
+                  <w:tcW w:type="dxa" w:w="3760"/>
                   <w:tcBorders>
                     <w:top w:val="single" w:color="BFBFBF" w:sz="4"/>
                     <w:left w:val="single" w:color="BFBFBF" w:sz="4"/>
@@ -2885,7 +2885,7 @@
               </w:tc>
               <w:tc>
                 <w:tcPr>
-                  <w:tcW w:type="dxa" w:w="3880"/>
+                  <w:tcW w:type="dxa" w:w="3760"/>
                   <w:tcBorders>
                     <w:top w:val="single" w:color="BFBFBF" w:sz="4"/>
                     <w:left w:val="single" w:color="BFBFBF" w:sz="4"/>
@@ -2955,7 +2955,7 @@
         </w:tc>
         <w:tc>
           <w:tcPr>
-            <w:tcW w:type="dxa" w:w="5500"/>
+            <w:tcW w:type="dxa" w:w="5380"/>
             <w:tcBorders>
               <w:top w:val="single" w:color="BFBFBF" w:sz="4"/>
               <w:left w:val="single" w:color="BFBFBF" w:sz="4"/>
@@ -2971,7 +2971,7 @@
           </w:tcPr>
           <w:tbl>
             <w:tblPr>
-              <w:tblW w:type="dxa" w:w="5380"/>
+              <w:tblW w:type="dxa" w:w="5260"/>
               <w:tblBorders>
                 <w:top w:val="single" w:color="auto" w:sz="4"/>
                 <w:left w:val="single" w:color="auto" w:sz="4"/>
@@ -2983,7 +2983,7 @@
             </w:tblPr>
             <w:tblGrid>
               <w:gridCol w:w="1500"/>
-              <w:gridCol w:w="3880"/>
+              <w:gridCol w:w="3760"/>
             </w:tblGrid>
             <w:tr>
               <w:tc>
@@ -3022,7 +3022,7 @@
               </w:tc>
               <w:tc>
                 <w:tcPr>
-                  <w:tcW w:type="dxa" w:w="3880"/>
+                  <w:tcW w:type="dxa" w:w="3760"/>
                   <w:tcBorders>
                     <w:top w:val="single" w:color="BFBFBF" w:sz="4"/>
                     <w:left w:val="single" w:color="BFBFBF" w:sz="4"/>
@@ -3092,7 +3092,7 @@
               </w:tc>
               <w:tc>
                 <w:tcPr>
-                  <w:tcW w:type="dxa" w:w="3880"/>
+                  <w:tcW w:type="dxa" w:w="3760"/>
                   <w:tcBorders>
                     <w:top w:val="single" w:color="BFBFBF" w:sz="4"/>
                     <w:left w:val="single" w:color="BFBFBF" w:sz="4"/>
@@ -3158,7 +3158,7 @@
               </w:tc>
               <w:tc>
                 <w:tcPr>
-                  <w:tcW w:type="dxa" w:w="3880"/>
+                  <w:tcW w:type="dxa" w:w="3760"/>
                   <w:tcBorders>
                     <w:top w:val="single" w:color="BFBFBF" w:sz="4"/>
                     <w:left w:val="single" w:color="BFBFBF" w:sz="4"/>
@@ -3224,7 +3224,7 @@
               </w:tc>
               <w:tc>
                 <w:tcPr>
-                  <w:tcW w:type="dxa" w:w="3880"/>
+                  <w:tcW w:type="dxa" w:w="3760"/>
                   <w:tcBorders>
                     <w:top w:val="single" w:color="BFBFBF" w:sz="4"/>
                     <w:left w:val="single" w:color="BFBFBF" w:sz="4"/>
@@ -3313,7 +3313,7 @@
               </w:tc>
               <w:tc>
                 <w:tcPr>
-                  <w:tcW w:type="dxa" w:w="3880"/>
+                  <w:tcW w:type="dxa" w:w="3760"/>
                   <w:tcBorders>
                     <w:top w:val="single" w:color="BFBFBF" w:sz="4"/>
                     <w:left w:val="single" w:color="BFBFBF" w:sz="4"/>
@@ -3474,7 +3474,7 @@
               </w:tc>
               <w:tc>
                 <w:tcPr>
-                  <w:tcW w:type="dxa" w:w="3880"/>
+                  <w:tcW w:type="dxa" w:w="3760"/>
                   <w:tcBorders>
                     <w:top w:val="single" w:color="BFBFBF" w:sz="4"/>
                     <w:left w:val="single" w:color="BFBFBF" w:sz="4"/>

</xml_diff>